<commit_message>
feat: Add Base Station Gateway Computer Enclosure specs to File 61 & rebuild docs
</commit_message>
<xml_diff>
--- a/09_Operations_&_Technical_Playbooks/61_Off_Grid_Telemetry_Node_PCBA_Manufacturing_&_Chinese_Factory_Sourcing_Manual.docx
+++ b/09_Operations_&_Technical_Playbooks/61_Off_Grid_Telemetry_Node_PCBA_Manufacturing_&_Chinese_Factory_Sourcing_Manual.docx
@@ -3147,6 +3147,1292 @@
       </w:r>
     </w:p>
     <w:p>
+      <w:pPr>
+        <w:spacing w:before="360" w:after="120"/>
+      </w:pPr>
+      <w:r>
+        <w:rPr>
+          <w:b/>
+          <w:color w:val="2E75B6"/>
+          <w:sz w:val="32"/>
+        </w:rPr>
+        <w:t>VI. Base Station Gateway Computer Enclosure &amp; Industrial Box-Build Sourcing</w:t>
+      </w:r>
+    </w:p>
+    <w:p>
+      <w:r>
+        <w:t xml:space="preserve">For the central data collection hub located at Co-Founder Hunter Morris's base cabin or mounted on high tower masts, a standard plastic case is insufficient. The base station gateway computer—typically a high-performance </w:t>
+      </w:r>
+      <w:r>
+        <w:rPr>
+          <w:b/>
+        </w:rPr>
+        <w:t>Raspberry Pi 5</w:t>
+      </w:r>
+      <w:r>
+        <w:t xml:space="preserve"> or </w:t>
+      </w:r>
+      <w:r>
+        <w:rPr>
+          <w:b/>
+        </w:rPr>
+        <w:t>Radxa Rock 5</w:t>
+      </w:r>
+      <w:r>
+        <w:t xml:space="preserve">—must be housed in a rugged, EMI-shielded, and thermally optimized industrial </w:t>
+      </w:r>
+      <w:r>
+        <w:rPr>
+          <w:b/>
+        </w:rPr>
+        <w:t>Extruded Aluminum Box-Build Enclosure</w:t>
+      </w:r>
+      <w:r>
+        <w:t>. This setup processes real-time geomorphic stream data and handles timeseries databases (SQLite/InfluxDB) without thermal throttling or SD card corruption.</w:t>
+      </w:r>
+    </w:p>
+    <w:p>
+      <w:pPr>
+        <w:spacing w:before="240" w:after="80"/>
+      </w:pPr>
+      <w:r>
+        <w:rPr>
+          <w:b/>
+          <w:color w:val="595959"/>
+          <w:sz w:val="26"/>
+        </w:rPr>
+        <w:t>1. Industrial Extruded Aluminum Enclosure Dimensions &amp; Mechanical Sourcing</w:t>
+      </w:r>
+    </w:p>
+    <w:p>
+      <w:pPr>
+        <w:pStyle w:val="ListBullet"/>
+        <w:spacing w:after="60"/>
+      </w:pPr>
+      <w:r/>
+      <w:r>
+        <w:rPr>
+          <w:b/>
+        </w:rPr>
+        <w:t>Supplier</w:t>
+      </w:r>
+      <w:r>
+        <w:t xml:space="preserve">: </w:t>
+      </w:r>
+      <w:r>
+        <w:rPr>
+          <w:b/>
+        </w:rPr>
+        <w:t>Shenzhen Szomk Electronic Co., Ltd. (SZOMK)</w:t>
+      </w:r>
+      <w:r>
+        <w:t xml:space="preserve"> or </w:t>
+      </w:r>
+      <w:r>
+        <w:rPr>
+          <w:b/>
+        </w:rPr>
+        <w:t>Foshan Nanhai Yonggu Technology Co., Ltd. (Yonggu)</w:t>
+      </w:r>
+      <w:r/>
+    </w:p>
+    <w:p>
+      <w:pPr>
+        <w:pStyle w:val="ListBullet"/>
+        <w:spacing w:after="60"/>
+      </w:pPr>
+      <w:r/>
+      <w:r>
+        <w:rPr>
+          <w:b/>
+        </w:rPr>
+        <w:t>Model/Part Number</w:t>
+      </w:r>
+      <w:r>
+        <w:t xml:space="preserve">: </w:t>
+      </w:r>
+      <w:r>
+        <w:rPr>
+          <w:b/>
+        </w:rPr>
+        <w:t>SZOMK AK-C-B80</w:t>
+      </w:r>
+      <w:r>
+        <w:t xml:space="preserve"> or </w:t>
+      </w:r>
+      <w:r>
+        <w:rPr>
+          <w:b/>
+        </w:rPr>
+        <w:t>Yonggu standard extruded aluminum chassis (120mm x 97mm x 40mm)</w:t>
+      </w:r>
+      <w:r/>
+    </w:p>
+    <w:p>
+      <w:pPr>
+        <w:pStyle w:val="ListBullet"/>
+        <w:spacing w:after="60"/>
+      </w:pPr>
+      <w:r/>
+      <w:r>
+        <w:rPr>
+          <w:b/>
+        </w:rPr>
+        <w:t>Material</w:t>
+      </w:r>
+      <w:r>
+        <w:t>: Extruded Aluminum Alloy 6063-T5 with Anodized Finish (Silver/Matte Black) for superior thermal conductivity and corrosion resistance.</w:t>
+      </w:r>
+    </w:p>
+    <w:p>
+      <w:pPr>
+        <w:pStyle w:val="ListBullet"/>
+        <w:spacing w:after="60"/>
+      </w:pPr>
+      <w:r/>
+      <w:r>
+        <w:rPr>
+          <w:b/>
+        </w:rPr>
+        <w:t>Mounting</w:t>
+      </w:r>
+      <w:r>
+        <w:t>: Integrated flanged mounting tabs for secure screw-down panel or wall installations. Optional DIN-rail clips.</w:t>
+      </w:r>
+    </w:p>
+    <w:p>
+      <w:pPr>
+        <w:spacing w:before="240" w:after="80"/>
+      </w:pPr>
+      <w:r>
+        <w:rPr>
+          <w:b/>
+          <w:color w:val="595959"/>
+          <w:sz w:val="26"/>
+        </w:rPr>
+        <w:t>2. Internal Components &amp; Hardware Stackup Layout</w:t>
+      </w:r>
+    </w:p>
+    <w:p>
+      <w:r>
+        <w:t>The gateway computer uses an industrial stackup that eliminates mechanical weaknesses (such as fragile micro-SD cards) and supports multi-channel LoRa concentrators:</w:t>
+      </w:r>
+    </w:p>
+    <w:p>
+      <w:pPr>
+        <w:spacing w:before="120" w:after="120"/>
+        <w:ind w:left="360"/>
+      </w:pPr>
+      <w:r>
+        <w:rPr>
+          <w:rFonts w:ascii="Consolas" w:hAnsi="Consolas"/>
+          <w:color w:val="7F0055"/>
+          <w:sz w:val="19"/>
+        </w:rPr>
+        <w:t xml:space="preserve">                  [BASE STATION GATEWAY COMPUTER INTERNAL STACKUP]</w:t>
+        <w:br/>
+        <w:br/>
+        <w:t xml:space="preserve">         +--------------------------------------------------------------+</w:t>
+        <w:br/>
+        <w:t xml:space="preserve">         | Industrial Anodized Aluminum Extruded Chassis (AK-C-B80)     |</w:t>
+        <w:br/>
+        <w:t xml:space="preserve">         |                                                              |</w:t>
+        <w:br/>
+        <w:t xml:space="preserve">         |  +--------------------------------------------------------+  |</w:t>
+        <w:br/>
+        <w:t xml:space="preserve">         |  | RAK5146 LoRaWAN / Meshtastic Concentrator Pi HAT       |  |</w:t>
+        <w:br/>
+        <w:t xml:space="preserve">         |  +---------------------------|----------------------------+  |</w:t>
+        <w:br/>
+        <w:t xml:space="preserve">         |                              | 40-Pin GPIO Header            |</w:t>
+        <w:br/>
+        <w:t xml:space="preserve">         |  +---------------------------v----------------------------+  |</w:t>
+        <w:br/>
+        <w:t xml:space="preserve">         |  | Raspberry Pi 5 (8GB RAM Single Board Computer)         |  |</w:t>
+        <w:br/>
+        <w:t xml:space="preserve">         |  +---------------------------|----------------------------+  |</w:t>
+        <w:br/>
+        <w:t xml:space="preserve">         |                              | PCIe FPC Cable Link           |</w:t>
+        <w:br/>
+        <w:t xml:space="preserve">         |  +---------------------------v----------------------------+  |</w:t>
+        <w:br/>
+        <w:t xml:space="preserve">         |  | Pineberry Pi HAT+ NVMe SSD Shield                      |  |</w:t>
+        <w:br/>
+        <w:t xml:space="preserve">         |  |  +--------------------------------------------------+  |  |</w:t>
+        <w:br/>
+        <w:t xml:space="preserve">         |  |  | 256GB Kingston Industrial M.2 NVMe SSD (X-7R)    |  |  |</w:t>
+        <w:br/>
+        <w:t xml:space="preserve">         |  |  +--------------------------------------------------+  |  |</w:t>
+        <w:br/>
+        <w:t xml:space="preserve">         |  +--------------------------------------------------------+  |</w:t>
+        <w:br/>
+        <w:t xml:space="preserve">         |                                                              |</w:t>
+        <w:br/>
+        <w:t xml:space="preserve">         |  +------------------------+      +------------------------+  |</w:t>
+        <w:br/>
+        <w:t xml:space="preserve">         |  | Mornsun 12V-to-5V 5A   |      | Integrated Solid       |  |</w:t>
+        <w:br/>
+        <w:t xml:space="preserve">         |  | DC-DC Buck Converter   |      | Copper Heat Block      |  |</w:t>
+        <w:br/>
+        <w:t xml:space="preserve">         |  +------------------------+      +------------------------+  |</w:t>
+        <w:br/>
+        <w:t xml:space="preserve">         +--------------------------------------------------------------+</w:t>
+      </w:r>
+    </w:p>
+    <w:p>
+      <w:pPr>
+        <w:spacing w:before="240" w:after="80"/>
+      </w:pPr>
+      <w:r>
+        <w:rPr>
+          <w:b/>
+          <w:color w:val="595959"/>
+          <w:sz w:val="26"/>
+        </w:rPr>
+        <w:t>3. Sourcing Specifications &amp; Connector Sizing Schedule</w:t>
+      </w:r>
+    </w:p>
+    <w:p>
+      <w:r>
+        <w:t>Vetted components for the base station gateway build are detailed below:</w:t>
+      </w:r>
+    </w:p>
+    <w:tbl>
+      <w:tblPr>
+        <w:tblW w:type="auto" w:w="0"/>
+        <w:jc w:val="center"/>
+        <w:tblLook w:firstColumn="1" w:firstRow="1" w:lastColumn="0" w:lastRow="0" w:noHBand="0" w:noVBand="1" w:val="04A0"/>
+        <w:tblBorders>
+          <w:top w:val="single" w:sz="4" w:space="0" w:color="BFBFBF"/>
+          <w:bottom w:val="single" w:sz="6" w:space="0" w:color="1F4E79"/>
+          <w:left w:val="none"/>
+          <w:right w:val="none"/>
+          <w:insideH w:val="single" w:sz="4" w:space="0" w:color="E0E0E0"/>
+          <w:insideV w:val="none"/>
+        </w:tblBorders>
+      </w:tblPr>
+      <w:tblGrid>
+        <w:gridCol w:w="2340"/>
+        <w:gridCol w:w="2340"/>
+        <w:gridCol w:w="2340"/>
+        <w:gridCol w:w="2340"/>
+      </w:tblGrid>
+      <w:tr>
+        <w:tc>
+          <w:tcPr>
+            <w:tcW w:type="dxa" w:w="2340"/>
+            <w:shd w:fill="1F4E79"/>
+            <w:tcMar>
+              <w:top w:w="140" w:type="dxa"/>
+              <w:bottom w:w="140" w:type="dxa"/>
+              <w:left w:w="150" w:type="dxa"/>
+              <w:right w:w="150" w:type="dxa"/>
+            </w:tcMar>
+          </w:tcPr>
+          <w:p>
+            <w:pPr>
+              <w:jc w:val="center"/>
+            </w:pPr>
+            <w:r>
+              <w:rPr>
+                <w:b/>
+                <w:color w:val="FFFFFF"/>
+                <w:sz w:val="20"/>
+              </w:rPr>
+              <w:t>Component / Sub-Assembly</w:t>
+            </w:r>
+          </w:p>
+        </w:tc>
+        <w:tc>
+          <w:tcPr>
+            <w:tcW w:type="dxa" w:w="2340"/>
+            <w:shd w:fill="1F4E79"/>
+            <w:tcMar>
+              <w:top w:w="140" w:type="dxa"/>
+              <w:bottom w:w="140" w:type="dxa"/>
+              <w:left w:w="150" w:type="dxa"/>
+              <w:right w:w="150" w:type="dxa"/>
+            </w:tcMar>
+          </w:tcPr>
+          <w:p>
+            <w:pPr>
+              <w:jc w:val="center"/>
+            </w:pPr>
+            <w:r>
+              <w:rPr>
+                <w:b/>
+                <w:color w:val="FFFFFF"/>
+                <w:sz w:val="20"/>
+              </w:rPr>
+              <w:t>Vetted Part Number</w:t>
+            </w:r>
+          </w:p>
+        </w:tc>
+        <w:tc>
+          <w:tcPr>
+            <w:tcW w:type="dxa" w:w="2340"/>
+            <w:shd w:fill="1F4E79"/>
+            <w:tcMar>
+              <w:top w:w="140" w:type="dxa"/>
+              <w:bottom w:w="140" w:type="dxa"/>
+              <w:left w:w="150" w:type="dxa"/>
+              <w:right w:w="150" w:type="dxa"/>
+            </w:tcMar>
+          </w:tcPr>
+          <w:p>
+            <w:pPr>
+              <w:jc w:val="center"/>
+            </w:pPr>
+            <w:r>
+              <w:rPr>
+                <w:b/>
+                <w:color w:val="FFFFFF"/>
+                <w:sz w:val="20"/>
+              </w:rPr>
+              <w:t>Chinese Factory Manufacturer</w:t>
+            </w:r>
+          </w:p>
+        </w:tc>
+        <w:tc>
+          <w:tcPr>
+            <w:tcW w:type="dxa" w:w="2340"/>
+            <w:shd w:fill="1F4E79"/>
+            <w:tcMar>
+              <w:top w:w="140" w:type="dxa"/>
+              <w:bottom w:w="140" w:type="dxa"/>
+              <w:left w:w="150" w:type="dxa"/>
+              <w:right w:w="150" w:type="dxa"/>
+            </w:tcMar>
+          </w:tcPr>
+          <w:p>
+            <w:pPr>
+              <w:jc w:val="center"/>
+            </w:pPr>
+            <w:r>
+              <w:rPr>
+                <w:b/>
+                <w:color w:val="FFFFFF"/>
+                <w:sz w:val="20"/>
+              </w:rPr>
+              <w:t>Function / Description</w:t>
+            </w:r>
+          </w:p>
+        </w:tc>
+      </w:tr>
+      <w:tr>
+        <w:tc>
+          <w:tcPr>
+            <w:tcW w:type="dxa" w:w="2340"/>
+            <w:tcMar>
+              <w:top w:w="100" w:type="dxa"/>
+              <w:bottom w:w="100" w:type="dxa"/>
+              <w:left w:w="150" w:type="dxa"/>
+              <w:right w:w="150" w:type="dxa"/>
+            </w:tcMar>
+          </w:tcPr>
+          <w:p>
+            <w:pPr>
+              <w:jc w:val="left"/>
+            </w:pPr>
+            <w:r>
+              <w:rPr>
+                <w:sz w:val="19"/>
+              </w:rPr>
+              <w:t>**SBC Computer**</w:t>
+            </w:r>
+          </w:p>
+        </w:tc>
+        <w:tc>
+          <w:tcPr>
+            <w:tcW w:type="dxa" w:w="2340"/>
+            <w:tcMar>
+              <w:top w:w="100" w:type="dxa"/>
+              <w:bottom w:w="100" w:type="dxa"/>
+              <w:left w:w="150" w:type="dxa"/>
+              <w:right w:w="150" w:type="dxa"/>
+            </w:tcMar>
+          </w:tcPr>
+          <w:p>
+            <w:pPr>
+              <w:jc w:val="left"/>
+            </w:pPr>
+            <w:r>
+              <w:rPr>
+                <w:sz w:val="19"/>
+              </w:rPr>
+              <w:t>Raspberry Pi 5 (8GB)</w:t>
+            </w:r>
+          </w:p>
+        </w:tc>
+        <w:tc>
+          <w:tcPr>
+            <w:tcW w:type="dxa" w:w="2340"/>
+            <w:tcMar>
+              <w:top w:w="100" w:type="dxa"/>
+              <w:bottom w:w="100" w:type="dxa"/>
+              <w:left w:w="150" w:type="dxa"/>
+              <w:right w:w="150" w:type="dxa"/>
+            </w:tcMar>
+          </w:tcPr>
+          <w:p>
+            <w:pPr>
+              <w:jc w:val="left"/>
+            </w:pPr>
+            <w:r>
+              <w:rPr>
+                <w:sz w:val="19"/>
+              </w:rPr>
+              <w:t>Raspberry Pi Foundation</w:t>
+            </w:r>
+          </w:p>
+        </w:tc>
+        <w:tc>
+          <w:tcPr>
+            <w:tcW w:type="dxa" w:w="2340"/>
+            <w:tcMar>
+              <w:top w:w="100" w:type="dxa"/>
+              <w:bottom w:w="100" w:type="dxa"/>
+              <w:left w:w="150" w:type="dxa"/>
+              <w:right w:w="150" w:type="dxa"/>
+            </w:tcMar>
+          </w:tcPr>
+          <w:p>
+            <w:pPr>
+              <w:jc w:val="left"/>
+            </w:pPr>
+            <w:r>
+              <w:rPr>
+                <w:sz w:val="19"/>
+              </w:rPr>
+              <w:t>Primary processing unit running Node-RED &amp; sync scripts.</w:t>
+            </w:r>
+          </w:p>
+        </w:tc>
+      </w:tr>
+      <w:tr>
+        <w:tc>
+          <w:tcPr>
+            <w:tcW w:type="dxa" w:w="2340"/>
+            <w:tcMar>
+              <w:top w:w="100" w:type="dxa"/>
+              <w:bottom w:w="100" w:type="dxa"/>
+              <w:left w:w="150" w:type="dxa"/>
+              <w:right w:w="150" w:type="dxa"/>
+            </w:tcMar>
+            <w:shd w:fill="F2F2F2"/>
+          </w:tcPr>
+          <w:p>
+            <w:pPr>
+              <w:jc w:val="left"/>
+            </w:pPr>
+            <w:r>
+              <w:rPr>
+                <w:sz w:val="19"/>
+              </w:rPr>
+              <w:t>**LoRa Concentrator**</w:t>
+            </w:r>
+          </w:p>
+        </w:tc>
+        <w:tc>
+          <w:tcPr>
+            <w:tcW w:type="dxa" w:w="2340"/>
+            <w:tcMar>
+              <w:top w:w="100" w:type="dxa"/>
+              <w:bottom w:w="100" w:type="dxa"/>
+              <w:left w:w="150" w:type="dxa"/>
+              <w:right w:w="150" w:type="dxa"/>
+            </w:tcMar>
+            <w:shd w:fill="F2F2F2"/>
+          </w:tcPr>
+          <w:p>
+            <w:pPr>
+              <w:jc w:val="left"/>
+            </w:pPr>
+            <w:r>
+              <w:rPr>
+                <w:sz w:val="19"/>
+              </w:rPr>
+              <w:t>RAK5146-SPI-915</w:t>
+            </w:r>
+          </w:p>
+        </w:tc>
+        <w:tc>
+          <w:tcPr>
+            <w:tcW w:type="dxa" w:w="2340"/>
+            <w:tcMar>
+              <w:top w:w="100" w:type="dxa"/>
+              <w:bottom w:w="100" w:type="dxa"/>
+              <w:left w:w="150" w:type="dxa"/>
+              <w:right w:w="150" w:type="dxa"/>
+            </w:tcMar>
+            <w:shd w:fill="F2F2F2"/>
+          </w:tcPr>
+          <w:p>
+            <w:pPr>
+              <w:jc w:val="left"/>
+            </w:pPr>
+            <w:r>
+              <w:rPr>
+                <w:sz w:val="19"/>
+              </w:rPr>
+              <w:t>RAKwireless Technology</w:t>
+            </w:r>
+          </w:p>
+        </w:tc>
+        <w:tc>
+          <w:tcPr>
+            <w:tcW w:type="dxa" w:w="2340"/>
+            <w:tcMar>
+              <w:top w:w="100" w:type="dxa"/>
+              <w:bottom w:w="100" w:type="dxa"/>
+              <w:left w:w="150" w:type="dxa"/>
+              <w:right w:w="150" w:type="dxa"/>
+            </w:tcMar>
+            <w:shd w:fill="F2F2F2"/>
+          </w:tcPr>
+          <w:p>
+            <w:pPr>
+              <w:jc w:val="left"/>
+            </w:pPr>
+            <w:r>
+              <w:rPr>
+                <w:sz w:val="19"/>
+              </w:rPr>
+              <w:t>Multi-channel LoRa concentrator HAT (polls 8 channels).</w:t>
+            </w:r>
+          </w:p>
+        </w:tc>
+      </w:tr>
+      <w:tr>
+        <w:tc>
+          <w:tcPr>
+            <w:tcW w:type="dxa" w:w="2340"/>
+            <w:tcMar>
+              <w:top w:w="100" w:type="dxa"/>
+              <w:bottom w:w="100" w:type="dxa"/>
+              <w:left w:w="150" w:type="dxa"/>
+              <w:right w:w="150" w:type="dxa"/>
+            </w:tcMar>
+          </w:tcPr>
+          <w:p>
+            <w:pPr>
+              <w:jc w:val="left"/>
+            </w:pPr>
+            <w:r>
+              <w:rPr>
+                <w:sz w:val="19"/>
+              </w:rPr>
+              <w:t>**NVMe SSD Shield**</w:t>
+            </w:r>
+          </w:p>
+        </w:tc>
+        <w:tc>
+          <w:tcPr>
+            <w:tcW w:type="dxa" w:w="2340"/>
+            <w:tcMar>
+              <w:top w:w="100" w:type="dxa"/>
+              <w:bottom w:w="100" w:type="dxa"/>
+              <w:left w:w="150" w:type="dxa"/>
+              <w:right w:w="150" w:type="dxa"/>
+            </w:tcMar>
+          </w:tcPr>
+          <w:p>
+            <w:pPr>
+              <w:jc w:val="left"/>
+            </w:pPr>
+            <w:r>
+              <w:rPr>
+                <w:sz w:val="19"/>
+              </w:rPr>
+              <w:t>Pineberry Pi Hat+</w:t>
+            </w:r>
+          </w:p>
+        </w:tc>
+        <w:tc>
+          <w:tcPr>
+            <w:tcW w:type="dxa" w:w="2340"/>
+            <w:tcMar>
+              <w:top w:w="100" w:type="dxa"/>
+              <w:bottom w:w="100" w:type="dxa"/>
+              <w:left w:w="150" w:type="dxa"/>
+              <w:right w:w="150" w:type="dxa"/>
+            </w:tcMar>
+          </w:tcPr>
+          <w:p>
+            <w:pPr>
+              <w:jc w:val="left"/>
+            </w:pPr>
+            <w:r>
+              <w:rPr>
+                <w:sz w:val="19"/>
+              </w:rPr>
+              <w:t>Pineberry Pi / Geekworm</w:t>
+            </w:r>
+          </w:p>
+        </w:tc>
+        <w:tc>
+          <w:tcPr>
+            <w:tcW w:type="dxa" w:w="2340"/>
+            <w:tcMar>
+              <w:top w:w="100" w:type="dxa"/>
+              <w:bottom w:w="100" w:type="dxa"/>
+              <w:left w:w="150" w:type="dxa"/>
+              <w:right w:w="150" w:type="dxa"/>
+            </w:tcMar>
+          </w:tcPr>
+          <w:p>
+            <w:pPr>
+              <w:jc w:val="left"/>
+            </w:pPr>
+            <w:r>
+              <w:rPr>
+                <w:sz w:val="19"/>
+              </w:rPr>
+              <w:t>PCIe Gen 2/3 NVMe interface board.</w:t>
+            </w:r>
+          </w:p>
+        </w:tc>
+      </w:tr>
+      <w:tr>
+        <w:tc>
+          <w:tcPr>
+            <w:tcW w:type="dxa" w:w="2340"/>
+            <w:tcMar>
+              <w:top w:w="100" w:type="dxa"/>
+              <w:bottom w:w="100" w:type="dxa"/>
+              <w:left w:w="150" w:type="dxa"/>
+              <w:right w:w="150" w:type="dxa"/>
+            </w:tcMar>
+            <w:shd w:fill="F2F2F2"/>
+          </w:tcPr>
+          <w:p>
+            <w:pPr>
+              <w:jc w:val="left"/>
+            </w:pPr>
+            <w:r>
+              <w:rPr>
+                <w:sz w:val="19"/>
+              </w:rPr>
+              <w:t>**Storage Medium**</w:t>
+            </w:r>
+          </w:p>
+        </w:tc>
+        <w:tc>
+          <w:tcPr>
+            <w:tcW w:type="dxa" w:w="2340"/>
+            <w:tcMar>
+              <w:top w:w="100" w:type="dxa"/>
+              <w:bottom w:w="100" w:type="dxa"/>
+              <w:left w:w="150" w:type="dxa"/>
+              <w:right w:w="150" w:type="dxa"/>
+            </w:tcMar>
+            <w:shd w:fill="F2F2F2"/>
+          </w:tcPr>
+          <w:p>
+            <w:pPr>
+              <w:jc w:val="left"/>
+            </w:pPr>
+            <w:r>
+              <w:rPr>
+                <w:sz w:val="19"/>
+              </w:rPr>
+              <w:t>Kingston DC1000B 240GB</w:t>
+            </w:r>
+          </w:p>
+        </w:tc>
+        <w:tc>
+          <w:tcPr>
+            <w:tcW w:type="dxa" w:w="2340"/>
+            <w:tcMar>
+              <w:top w:w="100" w:type="dxa"/>
+              <w:bottom w:w="100" w:type="dxa"/>
+              <w:left w:w="150" w:type="dxa"/>
+              <w:right w:w="150" w:type="dxa"/>
+            </w:tcMar>
+            <w:shd w:fill="F2F2F2"/>
+          </w:tcPr>
+          <w:p>
+            <w:pPr>
+              <w:jc w:val="left"/>
+            </w:pPr>
+            <w:r>
+              <w:rPr>
+                <w:sz w:val="19"/>
+              </w:rPr>
+              <w:t>Kingston / LCSC</w:t>
+            </w:r>
+          </w:p>
+        </w:tc>
+        <w:tc>
+          <w:tcPr>
+            <w:tcW w:type="dxa" w:w="2340"/>
+            <w:tcMar>
+              <w:top w:w="100" w:type="dxa"/>
+              <w:bottom w:w="100" w:type="dxa"/>
+              <w:left w:w="150" w:type="dxa"/>
+              <w:right w:w="150" w:type="dxa"/>
+            </w:tcMar>
+            <w:shd w:fill="F2F2F2"/>
+          </w:tcPr>
+          <w:p>
+            <w:pPr>
+              <w:jc w:val="left"/>
+            </w:pPr>
+            <w:r>
+              <w:rPr>
+                <w:sz w:val="19"/>
+              </w:rPr>
+              <w:t>Industrial-grade high-TBW NVMe M.2 SSD.</w:t>
+            </w:r>
+          </w:p>
+        </w:tc>
+      </w:tr>
+      <w:tr>
+        <w:tc>
+          <w:tcPr>
+            <w:tcW w:type="dxa" w:w="2340"/>
+            <w:tcMar>
+              <w:top w:w="100" w:type="dxa"/>
+              <w:bottom w:w="100" w:type="dxa"/>
+              <w:left w:w="150" w:type="dxa"/>
+              <w:right w:w="150" w:type="dxa"/>
+            </w:tcMar>
+          </w:tcPr>
+          <w:p>
+            <w:pPr>
+              <w:jc w:val="left"/>
+            </w:pPr>
+            <w:r>
+              <w:rPr>
+                <w:sz w:val="19"/>
+              </w:rPr>
+              <w:t>**Power Supply**</w:t>
+            </w:r>
+          </w:p>
+        </w:tc>
+        <w:tc>
+          <w:tcPr>
+            <w:tcW w:type="dxa" w:w="2340"/>
+            <w:tcMar>
+              <w:top w:w="100" w:type="dxa"/>
+              <w:bottom w:w="100" w:type="dxa"/>
+              <w:left w:w="150" w:type="dxa"/>
+              <w:right w:w="150" w:type="dxa"/>
+            </w:tcMar>
+          </w:tcPr>
+          <w:p>
+            <w:pPr>
+              <w:jc w:val="left"/>
+            </w:pPr>
+            <w:r>
+              <w:rPr>
+                <w:sz w:val="19"/>
+              </w:rPr>
+              <w:t>Mornsun K7805-500R3</w:t>
+            </w:r>
+          </w:p>
+        </w:tc>
+        <w:tc>
+          <w:tcPr>
+            <w:tcW w:type="dxa" w:w="2340"/>
+            <w:tcMar>
+              <w:top w:w="100" w:type="dxa"/>
+              <w:bottom w:w="100" w:type="dxa"/>
+              <w:left w:w="150" w:type="dxa"/>
+              <w:right w:w="150" w:type="dxa"/>
+            </w:tcMar>
+          </w:tcPr>
+          <w:p>
+            <w:pPr>
+              <w:jc w:val="left"/>
+            </w:pPr>
+            <w:r>
+              <w:rPr>
+                <w:sz w:val="19"/>
+              </w:rPr>
+              <w:t>Mornsun Shenzhen</w:t>
+            </w:r>
+          </w:p>
+        </w:tc>
+        <w:tc>
+          <w:tcPr>
+            <w:tcW w:type="dxa" w:w="2340"/>
+            <w:tcMar>
+              <w:top w:w="100" w:type="dxa"/>
+              <w:bottom w:w="100" w:type="dxa"/>
+              <w:left w:w="150" w:type="dxa"/>
+              <w:right w:w="150" w:type="dxa"/>
+            </w:tcMar>
+          </w:tcPr>
+          <w:p>
+            <w:pPr>
+              <w:jc w:val="left"/>
+            </w:pPr>
+            <w:r>
+              <w:rPr>
+                <w:sz w:val="19"/>
+              </w:rPr>
+              <w:t>High-efficiency 12V-to-5V DC-DC buck converter.</w:t>
+            </w:r>
+          </w:p>
+        </w:tc>
+      </w:tr>
+      <w:tr>
+        <w:tc>
+          <w:tcPr>
+            <w:tcW w:type="dxa" w:w="2340"/>
+            <w:tcMar>
+              <w:top w:w="100" w:type="dxa"/>
+              <w:bottom w:w="100" w:type="dxa"/>
+              <w:left w:w="150" w:type="dxa"/>
+              <w:right w:w="150" w:type="dxa"/>
+            </w:tcMar>
+            <w:shd w:fill="F2F2F2"/>
+          </w:tcPr>
+          <w:p>
+            <w:pPr>
+              <w:jc w:val="left"/>
+            </w:pPr>
+            <w:r>
+              <w:rPr>
+                <w:sz w:val="19"/>
+              </w:rPr>
+              <w:t>**Chassis**</w:t>
+            </w:r>
+          </w:p>
+        </w:tc>
+        <w:tc>
+          <w:tcPr>
+            <w:tcW w:type="dxa" w:w="2340"/>
+            <w:tcMar>
+              <w:top w:w="100" w:type="dxa"/>
+              <w:bottom w:w="100" w:type="dxa"/>
+              <w:left w:w="150" w:type="dxa"/>
+              <w:right w:w="150" w:type="dxa"/>
+            </w:tcMar>
+            <w:shd w:fill="F2F2F2"/>
+          </w:tcPr>
+          <w:p>
+            <w:pPr>
+              <w:jc w:val="left"/>
+            </w:pPr>
+            <w:r>
+              <w:rPr>
+                <w:sz w:val="19"/>
+              </w:rPr>
+              <w:t>AK-C-B80 (120x97x40mm)</w:t>
+            </w:r>
+          </w:p>
+        </w:tc>
+        <w:tc>
+          <w:tcPr>
+            <w:tcW w:type="dxa" w:w="2340"/>
+            <w:tcMar>
+              <w:top w:w="100" w:type="dxa"/>
+              <w:bottom w:w="100" w:type="dxa"/>
+              <w:left w:w="150" w:type="dxa"/>
+              <w:right w:w="150" w:type="dxa"/>
+            </w:tcMar>
+            <w:shd w:fill="F2F2F2"/>
+          </w:tcPr>
+          <w:p>
+            <w:pPr>
+              <w:jc w:val="left"/>
+            </w:pPr>
+            <w:r>
+              <w:rPr>
+                <w:sz w:val="19"/>
+              </w:rPr>
+              <w:t>Shenzhen SZOMK</w:t>
+            </w:r>
+          </w:p>
+        </w:tc>
+        <w:tc>
+          <w:tcPr>
+            <w:tcW w:type="dxa" w:w="2340"/>
+            <w:tcMar>
+              <w:top w:w="100" w:type="dxa"/>
+              <w:bottom w:w="100" w:type="dxa"/>
+              <w:left w:w="150" w:type="dxa"/>
+              <w:right w:w="150" w:type="dxa"/>
+            </w:tcMar>
+            <w:shd w:fill="F2F2F2"/>
+          </w:tcPr>
+          <w:p>
+            <w:pPr>
+              <w:jc w:val="left"/>
+            </w:pPr>
+            <w:r>
+              <w:rPr>
+                <w:sz w:val="19"/>
+              </w:rPr>
+              <w:t>Heavy extruded aluminum chassis w/ flanged end-plates.</w:t>
+            </w:r>
+          </w:p>
+        </w:tc>
+      </w:tr>
+      <w:tr>
+        <w:tc>
+          <w:tcPr>
+            <w:tcW w:type="dxa" w:w="2340"/>
+            <w:tcMar>
+              <w:top w:w="100" w:type="dxa"/>
+              <w:bottom w:w="100" w:type="dxa"/>
+              <w:left w:w="150" w:type="dxa"/>
+              <w:right w:w="150" w:type="dxa"/>
+            </w:tcMar>
+          </w:tcPr>
+          <w:p>
+            <w:pPr>
+              <w:jc w:val="left"/>
+            </w:pPr>
+            <w:r>
+              <w:rPr>
+                <w:sz w:val="19"/>
+              </w:rPr>
+              <w:t>**Antenna Bulkheads**</w:t>
+            </w:r>
+          </w:p>
+        </w:tc>
+        <w:tc>
+          <w:tcPr>
+            <w:tcW w:type="dxa" w:w="2340"/>
+            <w:tcMar>
+              <w:top w:w="100" w:type="dxa"/>
+              <w:bottom w:w="100" w:type="dxa"/>
+              <w:left w:w="150" w:type="dxa"/>
+              <w:right w:w="150" w:type="dxa"/>
+            </w:tcMar>
+          </w:tcPr>
+          <w:p>
+            <w:pPr>
+              <w:jc w:val="left"/>
+            </w:pPr>
+            <w:r>
+              <w:rPr>
+                <w:sz w:val="19"/>
+              </w:rPr>
+              <w:t>IPEX-1 to RP-SMA-K</w:t>
+            </w:r>
+          </w:p>
+        </w:tc>
+        <w:tc>
+          <w:tcPr>
+            <w:tcW w:type="dxa" w:w="2340"/>
+            <w:tcMar>
+              <w:top w:w="100" w:type="dxa"/>
+              <w:bottom w:w="100" w:type="dxa"/>
+              <w:left w:w="150" w:type="dxa"/>
+              <w:right w:w="150" w:type="dxa"/>
+            </w:tcMar>
+          </w:tcPr>
+          <w:p>
+            <w:pPr>
+              <w:jc w:val="left"/>
+            </w:pPr>
+            <w:r>
+              <w:rPr>
+                <w:sz w:val="19"/>
+              </w:rPr>
+              <w:t>Shenzhen Ebyte</w:t>
+            </w:r>
+          </w:p>
+        </w:tc>
+        <w:tc>
+          <w:tcPr>
+            <w:tcW w:type="dxa" w:w="2340"/>
+            <w:tcMar>
+              <w:top w:w="100" w:type="dxa"/>
+              <w:bottom w:w="100" w:type="dxa"/>
+              <w:left w:w="150" w:type="dxa"/>
+              <w:right w:w="150" w:type="dxa"/>
+            </w:tcMar>
+          </w:tcPr>
+          <w:p>
+            <w:pPr>
+              <w:jc w:val="left"/>
+            </w:pPr>
+            <w:r>
+              <w:rPr>
+                <w:sz w:val="19"/>
+              </w:rPr>
+              <w:t>RG178 coaxial pigtail bulkheads with locking nuts.</w:t>
+            </w:r>
+          </w:p>
+        </w:tc>
+      </w:tr>
+      <w:tr>
+        <w:tc>
+          <w:tcPr>
+            <w:tcW w:type="dxa" w:w="2340"/>
+            <w:tcMar>
+              <w:top w:w="100" w:type="dxa"/>
+              <w:bottom w:w="100" w:type="dxa"/>
+              <w:left w:w="150" w:type="dxa"/>
+              <w:right w:w="150" w:type="dxa"/>
+            </w:tcMar>
+            <w:shd w:fill="F2F2F2"/>
+          </w:tcPr>
+          <w:p>
+            <w:pPr>
+              <w:jc w:val="left"/>
+            </w:pPr>
+            <w:r>
+              <w:rPr>
+                <w:sz w:val="19"/>
+              </w:rPr>
+              <w:t>**Waterproof Glands**</w:t>
+            </w:r>
+          </w:p>
+        </w:tc>
+        <w:tc>
+          <w:tcPr>
+            <w:tcW w:type="dxa" w:w="2340"/>
+            <w:tcMar>
+              <w:top w:w="100" w:type="dxa"/>
+              <w:bottom w:w="100" w:type="dxa"/>
+              <w:left w:w="150" w:type="dxa"/>
+              <w:right w:w="150" w:type="dxa"/>
+            </w:tcMar>
+            <w:shd w:fill="F2F2F2"/>
+          </w:tcPr>
+          <w:p>
+            <w:pPr>
+              <w:jc w:val="left"/>
+            </w:pPr>
+            <w:r>
+              <w:rPr>
+                <w:sz w:val="19"/>
+              </w:rPr>
+              <w:t>PG7 Brass Gland</w:t>
+            </w:r>
+          </w:p>
+        </w:tc>
+        <w:tc>
+          <w:tcPr>
+            <w:tcW w:type="dxa" w:w="2340"/>
+            <w:tcMar>
+              <w:top w:w="100" w:type="dxa"/>
+              <w:bottom w:w="100" w:type="dxa"/>
+              <w:left w:w="150" w:type="dxa"/>
+              <w:right w:w="150" w:type="dxa"/>
+            </w:tcMar>
+            <w:shd w:fill="F2F2F2"/>
+          </w:tcPr>
+          <w:p>
+            <w:pPr>
+              <w:jc w:val="left"/>
+            </w:pPr>
+            <w:r>
+              <w:rPr>
+                <w:sz w:val="19"/>
+              </w:rPr>
+              <w:t>Yueqing Liron</w:t>
+            </w:r>
+          </w:p>
+        </w:tc>
+        <w:tc>
+          <w:tcPr>
+            <w:tcW w:type="dxa" w:w="2340"/>
+            <w:tcMar>
+              <w:top w:w="100" w:type="dxa"/>
+              <w:bottom w:w="100" w:type="dxa"/>
+              <w:left w:w="150" w:type="dxa"/>
+              <w:right w:w="150" w:type="dxa"/>
+            </w:tcMar>
+            <w:shd w:fill="F2F2F2"/>
+          </w:tcPr>
+          <w:p>
+            <w:pPr>
+              <w:jc w:val="left"/>
+            </w:pPr>
+            <w:r>
+              <w:rPr>
+                <w:sz w:val="19"/>
+              </w:rPr>
+              <w:t>Brass nickel-plated compression glands for power/LAN.</w:t>
+            </w:r>
+          </w:p>
+        </w:tc>
+      </w:tr>
+    </w:tbl>
+    <w:p>
+      <w:pPr>
+        <w:spacing w:before="160"/>
+      </w:pPr>
+    </w:p>
+    <w:p>
+      <w:pPr>
+        <w:spacing w:before="240" w:after="80"/>
+      </w:pPr>
+      <w:r>
+        <w:rPr>
+          <w:b/>
+          <w:color w:val="595959"/>
+          <w:sz w:val="26"/>
+        </w:rPr>
+        <w:t>4. Thermal Management &amp; Port Interface Details</w:t>
+      </w:r>
+    </w:p>
+    <w:p>
+      <w:pPr>
+        <w:pStyle w:val="ListBullet"/>
+        <w:spacing w:after="60"/>
+      </w:pPr>
+      <w:r/>
+      <w:r>
+        <w:rPr>
+          <w:b/>
+        </w:rPr>
+        <w:t>Passive Conduction Cooling</w:t>
+      </w:r>
+      <w:r>
+        <w:t xml:space="preserve">: The aluminum enclosure features customized internal mounting standoffs and a </w:t>
+      </w:r>
+      <w:r>
+        <w:rPr>
+          <w:b/>
+        </w:rPr>
+        <w:t>solid copper thermal block (15mm x 15mm x 6.5mm)</w:t>
+      </w:r>
+      <w:r>
+        <w:t xml:space="preserve"> that directly bridges the Raspberry Pi 5 Broadcom BCM2712 CPU with the heavy aluminum chassis wall. This acts as a giant heatsink, maintaining CPU temps below 113°F (45°C) even under maximum load in hot summer cabin attics.</w:t>
+      </w:r>
+    </w:p>
+    <w:p>
+      <w:pPr>
+        <w:pStyle w:val="ListBullet"/>
+        <w:spacing w:after="60"/>
+      </w:pPr>
+      <w:r/>
+      <w:r>
+        <w:rPr>
+          <w:b/>
+        </w:rPr>
+        <w:t>External Connectors Layout</w:t>
+      </w:r>
+      <w:r>
+        <w:t>:</w:t>
+      </w:r>
+    </w:p>
+    <w:p>
+      <w:pPr>
+        <w:pStyle w:val="ListBullet"/>
+        <w:spacing w:after="60"/>
+      </w:pPr>
+      <w:r>
+        <w:t>*Side A (Flanged End Plate)*:</w:t>
+      </w:r>
+    </w:p>
+    <w:p>
+      <w:pPr>
+        <w:pStyle w:val="ListBullet"/>
+        <w:spacing w:after="60"/>
+      </w:pPr>
+      <w:r>
+        <w:t xml:space="preserve">Two </w:t>
+      </w:r>
+      <w:r>
+        <w:rPr>
+          <w:b/>
+        </w:rPr>
+        <w:t>RP-SMA female bulkhead connectors</w:t>
+      </w:r>
+      <w:r>
+        <w:t xml:space="preserve"> for external high-gain antennas (one tuned to 915 MHz LoRa, one for 2.4 GHz WiFi).</w:t>
+      </w:r>
+    </w:p>
+    <w:p>
+      <w:pPr>
+        <w:pStyle w:val="ListBullet"/>
+        <w:spacing w:after="60"/>
+      </w:pPr>
+      <w:r>
+        <w:t xml:space="preserve">One </w:t>
+      </w:r>
+      <w:r>
+        <w:rPr>
+          <w:b/>
+        </w:rPr>
+        <w:t>PG7 brass gland</w:t>
+      </w:r>
+      <w:r>
+        <w:t xml:space="preserve"> feeding the 12V/24V DC input cable from the cabin solar battery bank.</w:t>
+      </w:r>
+    </w:p>
+    <w:p>
+      <w:pPr>
+        <w:pStyle w:val="ListBullet"/>
+        <w:spacing w:after="60"/>
+      </w:pPr>
+      <w:r>
+        <w:t>*Side B (Flanged End Plate)*:</w:t>
+      </w:r>
+    </w:p>
+    <w:p>
+      <w:pPr>
+        <w:pStyle w:val="ListBullet"/>
+        <w:spacing w:after="60"/>
+      </w:pPr>
+      <w:r>
+        <w:t xml:space="preserve">One waterproof </w:t>
+      </w:r>
+      <w:r>
+        <w:rPr>
+          <w:b/>
+        </w:rPr>
+        <w:t>RJ45 bulkhead connector (IP67 plastic coupling)</w:t>
+      </w:r>
+      <w:r>
+        <w:t xml:space="preserve"> providing a secure, sealed local area network (LAN) port for field debugging or wired cabin network connection.</w:t>
+      </w:r>
+    </w:p>
+    <w:p>
+      <w:pPr>
+        <w:pStyle w:val="ListBullet"/>
+        <w:spacing w:after="60"/>
+      </w:pPr>
+      <w:r>
+        <w:t>Laser-etched status LED indicators (Power, LoRa Rx/Tx, internet status).</w:t>
+      </w:r>
+    </w:p>
+    <w:p>
+      <w:pPr>
+        <w:pStyle w:val="ListBullet"/>
+        <w:spacing w:after="60"/>
+      </w:pPr>
+      <w:r/>
+      <w:r>
+        <w:rPr>
+          <w:b/>
+        </w:rPr>
+        <w:t>Power Distribution</w:t>
+      </w:r>
+      <w:r>
+        <w:t xml:space="preserve">: The Mornsun buck regulator steps down the variable 12V–24V DC battery line to a stable 5.0V (up to 5A) routed directly to the Pi's power test pads (pins 2 and 4), bypassing the fragile USB-C connector. A built-in transient voltage suppressor (TVS) diode (LCSC </w:t>
+      </w:r>
+      <w:r>
+        <w:rPr>
+          <w:b/>
+        </w:rPr>
+        <w:t>SMBJ5.0A</w:t>
+      </w:r>
+      <w:r>
+        <w:t>) protects the computer from power surges caused by lightning strikes on high tower antennas.</w:t>
+      </w:r>
+    </w:p>
+    <w:p>
+      <w:pPr>
+        <w:spacing w:after="240"/>
+      </w:pPr>
+      <w:r>
+        <w:rPr>
+          <w:color w:val="D9D9D9"/>
+        </w:rPr>
+        <w:t>____________________________________________________</w:t>
+      </w:r>
+    </w:p>
+    <w:p>
       <w:r>
         <w:t>*Developed by Blue Ridge Stream Restoration Technical Sourcing Operations. Pushed to remote origin under main.*</w:t>
       </w:r>

</xml_diff>

<commit_message>
feat: Add Off-The-Shelf WisBlock solderless integration blueprint to File 61 & rebuild docs
</commit_message>
<xml_diff>
--- a/09_Operations_&_Technical_Playbooks/61_Off_Grid_Telemetry_Node_PCBA_Manufacturing_&_Chinese_Factory_Sourcing_Manual.docx
+++ b/09_Operations_&_Technical_Playbooks/61_Off_Grid_Telemetry_Node_PCBA_Manufacturing_&_Chinese_Factory_Sourcing_Manual.docx
@@ -2604,12 +2604,297 @@
           <w:color w:val="2E75B6"/>
           <w:sz w:val="32"/>
         </w:rPr>
-        <w:t>IV. Enclosure Box &amp; Physical Gland Assembly Layout</w:t>
+        <w:t>IV. Rapid-Deployment Sourcing: Off-The-Shelf WisBlock Assembly (No Custom PCB)</w:t>
       </w:r>
     </w:p>
     <w:p>
       <w:r>
-        <w:t xml:space="preserve">Streamside environmental sensors are exposed to high humidity, flood splattering, and animal tampering. Hunter Morris's operations interns assemble each node into a ruggedized, waterproof </w:t>
+        <w:t>For rapid field pilots or quick regional stream rollouts, Co-Founder Hunter Morris and his operations team can bypass custom PCB manufacturing entirely. Instead, they can assemble highly reliable off-grid telemetry nodes in under 30 minutes using standard, pre-existing developer boards and modules. These modular components plug directly together without soldering, creating a clean, professional, and easily maintainable streamside telemetry system.</w:t>
+      </w:r>
+    </w:p>
+    <w:p>
+      <w:pPr>
+        <w:spacing w:before="240" w:after="80"/>
+      </w:pPr>
+      <w:r>
+        <w:rPr>
+          <w:b/>
+          <w:color w:val="595959"/>
+          <w:sz w:val="26"/>
+        </w:rPr>
+        <w:t>1. Off-the-Shelf Hardware Sourcing Schedule (The WisBlock Ecosystem)</w:t>
+      </w:r>
+    </w:p>
+    <w:p>
+      <w:r>
+        <w:t>By leveraging RAKwireless's pre-engineered modular hardware, the telemetry node is built using these existing boards:</w:t>
+      </w:r>
+    </w:p>
+    <w:p>
+      <w:pPr>
+        <w:pStyle w:val="ListBullet"/>
+        <w:spacing w:after="60"/>
+      </w:pPr>
+      <w:r/>
+      <w:r>
+        <w:rPr>
+          <w:b/>
+        </w:rPr>
+        <w:t>RAK19007 WisBlock Base Board ($10.50)</w:t>
+      </w:r>
+      <w:r>
+        <w:t>: The baseboard that provides clean power distribution pathways, internal interconnect slots, a micro-USB programming/charging port, a built-in TP4054 Li-ion/LiFePO4 battery solar charger, and standard JST-PH battery and solar connectors.</w:t>
+      </w:r>
+    </w:p>
+    <w:p>
+      <w:pPr>
+        <w:pStyle w:val="ListBullet"/>
+        <w:spacing w:after="60"/>
+      </w:pPr>
+      <w:r/>
+      <w:r>
+        <w:rPr>
+          <w:b/>
+        </w:rPr>
+        <w:t>RAK4631 BLE LoRa Core MCU ($20.00)</w:t>
+      </w:r>
+      <w:r>
+        <w:t>: The central processing unit featuring Nordic’s nRF52840 low-power microcontroller and Semtech’s SX1262 LoRa transceiver. Plugs directly into the central CPU slot of the RAK19007 baseboard.</w:t>
+      </w:r>
+    </w:p>
+    <w:p>
+      <w:pPr>
+        <w:pStyle w:val="ListBullet"/>
+        <w:spacing w:after="60"/>
+      </w:pPr>
+      <w:r/>
+      <w:r>
+        <w:rPr>
+          <w:b/>
+        </w:rPr>
+        <w:t>RAK5802 WisBlock RS485 Modbus Interface Module ($9.50)</w:t>
+      </w:r>
+      <w:r>
+        <w:t>: A hardware-isolated RS485 transceiver board that plugs directly into Slot D of the RAK19007 baseboard. It provides built-in TVS protection diodes, electrostatic discharge protection, and a highly accessible 4-pin screw terminal block carrying `VCC_5V` (or `VBAT`), `GND`, `RS485-A`, and `RS485-B` signals.</w:t>
+      </w:r>
+    </w:p>
+    <w:p>
+      <w:pPr>
+        <w:pStyle w:val="ListBullet"/>
+        <w:spacing w:after="60"/>
+      </w:pPr>
+      <w:r/>
+      <w:r>
+        <w:rPr>
+          <w:b/>
+        </w:rPr>
+        <w:t>Pre-Assembled MT3608 step-up boost module ($1.20)</w:t>
+      </w:r>
+      <w:r>
+        <w:t>: A cheap, compact off-the-shelf boost module used to step up the battery's 3.7V power up to a stable 12.0V DC required by industrial dissolved oxygen and turbidity sensors.</w:t>
+      </w:r>
+    </w:p>
+    <w:p>
+      <w:pPr>
+        <w:spacing w:before="240" w:after="80"/>
+      </w:pPr>
+      <w:r>
+        <w:rPr>
+          <w:b/>
+          <w:color w:val="595959"/>
+          <w:sz w:val="26"/>
+        </w:rPr>
+        <w:t>2. Solderless Wire-by-Wire Assembly Connection Table</w:t>
+      </w:r>
+    </w:p>
+    <w:p>
+      <w:r>
+        <w:t>To construct the switched 12V sensor power controller using only existing boards, connect the components as follows using standard pre-crimped JST jumper cables and the RAK5802 screw terminals:</w:t>
+      </w:r>
+    </w:p>
+    <w:p>
+      <w:pPr>
+        <w:spacing w:before="120" w:after="120"/>
+        <w:ind w:left="360"/>
+      </w:pPr>
+      <w:r>
+        <w:rPr>
+          <w:rFonts w:ascii="Consolas" w:hAnsi="Consolas"/>
+          <w:color w:val="7F0055"/>
+          <w:sz w:val="19"/>
+        </w:rPr>
+        <w:t xml:space="preserve">          [SOLDERLESS OFF-THE-SHELF TELEMETRY ELECTRICAL BLUEPRINT]</w:t>
+        <w:br/>
+        <w:br/>
+        <w:t xml:space="preserve">      +-----------------------------------------------------------+</w:t>
+        <w:br/>
+        <w:t xml:space="preserve">      |  RAK19007 WisBlock Base Board                             |</w:t>
+        <w:br/>
+        <w:t xml:space="preserve">      |                                                           |</w:t>
+        <w:br/>
+        <w:t xml:space="preserve">      |  [Slot CPU] ===&gt; RAK4631 BLE LoRa module plugged in       |</w:t>
+        <w:br/>
+        <w:t xml:space="preserve">      |  [Slot D]   ===&gt; RAK5802 RS485 Module plugged in          |</w:t>
+        <w:br/>
+        <w:t xml:space="preserve">      |                                                           |</w:t>
+        <w:br/>
+        <w:t xml:space="preserve">      |  Power Terminals:                                         |</w:t>
+        <w:br/>
+        <w:t xml:space="preserve">      |    - 3V3 Pin   ======&gt; (Not Connected)                    |</w:t>
+        <w:br/>
+        <w:t xml:space="preserve">      |    - VBAT Pin  ======&gt; Connected to MT3608 Boost [VIN+]    |</w:t>
+        <w:br/>
+        <w:t xml:space="preserve">      |    - GND Pin   ======&gt; Connected to MT3608 Boost [VIN-]    |</w:t>
+        <w:br/>
+        <w:t xml:space="preserve">      |    - IO1 Pin   ======&gt; Connected to MT3608 Boost [EN]     |</w:t>
+        <w:br/>
+        <w:t xml:space="preserve">      |                                                           |</w:t>
+        <w:br/>
+        <w:t xml:space="preserve">      |  RAK5802 Screw Terminals:                                 |</w:t>
+        <w:br/>
+        <w:t xml:space="preserve">      |    - RXD/TXD   ======&gt; (Handled internally by baseboard)   |</w:t>
+        <w:br/>
+        <w:t xml:space="preserve">      |    - A Pin     ======&gt; Connected to WAGO Term 3 (Sensor A) |</w:t>
+        <w:br/>
+        <w:t xml:space="preserve">      |    - B Pin     ======&gt; Connected to WAGO Term 4 (Sensor B) |</w:t>
+        <w:br/>
+        <w:t xml:space="preserve">      +-----------------------------------------------------------+</w:t>
+        <w:br/>
+        <w:t xml:space="preserve">                                   |</w:t>
+        <w:br/>
+        <w:t xml:space="preserve">                                   v</w:t>
+        <w:br/>
+        <w:t xml:space="preserve">      +-----------------------------------------------------------+</w:t>
+        <w:br/>
+        <w:t xml:space="preserve">      |  Off-the-Shelf MT3608 Step-Up Boost Module ($1.20)         |</w:t>
+        <w:br/>
+        <w:t xml:space="preserve">      |                                                           |</w:t>
+        <w:br/>
+        <w:t xml:space="preserve">      |  Input Terminals:                                         |</w:t>
+        <w:br/>
+        <w:t xml:space="preserve">      |    - VIN+      &lt;====== Connected to RAK19007 [VBAT Pin]    |</w:t>
+        <w:br/>
+        <w:t xml:space="preserve">      |    - VIN-      &lt;====== Connected to RAK19007 [GND Pin]     |</w:t>
+        <w:br/>
+        <w:t xml:space="preserve">      |    - EN (Pin)  &lt;====== Connected to RAK19007 [IO1 Pin]     |</w:t>
+        <w:br/>
+        <w:t xml:space="preserve">      |                                                           |</w:t>
+        <w:br/>
+        <w:t xml:space="preserve">      |  Output Terminals (Adjust pot to exactly 12.0V DC):       |</w:t>
+        <w:br/>
+        <w:t xml:space="preserve">      |    - OUT+      ======&gt; Connected to WAGO Term 1 (Sensor VCC)|</w:t>
+        <w:br/>
+        <w:t xml:space="preserve">      |    - OUT-      ======&gt; Connected to WAGO Term 2 (Sensor GND)|</w:t>
+        <w:br/>
+        <w:t xml:space="preserve">      +-----------------------------------------------------------+</w:t>
+      </w:r>
+    </w:p>
+    <w:p>
+      <w:pPr>
+        <w:spacing w:before="240" w:after="80"/>
+      </w:pPr>
+      <w:r>
+        <w:rPr>
+          <w:b/>
+          <w:color w:val="595959"/>
+          <w:sz w:val="26"/>
+        </w:rPr>
+        <w:t>3. Step-by-Step Integration &amp; Sizing Guidelines:</w:t>
+      </w:r>
+    </w:p>
+    <w:p>
+      <w:pPr>
+        <w:pStyle w:val="ListNumber"/>
+        <w:spacing w:after="60"/>
+      </w:pPr>
+      <w:r/>
+      <w:r>
+        <w:rPr>
+          <w:b/>
+        </w:rPr>
+        <w:t>Potentiometer Calibration</w:t>
+      </w:r>
+      <w:r>
+        <w:t xml:space="preserve">: Before connecting any expensive sensors, connect a 3.7V battery to the RAK19007 baseboard, run a test firmware that pulls pin `IO1` HIGH, and measure the voltage at the MT3608 `OUT+` and `OUT-` terminals using a multimeter. Use a small flathead screwdriver to turn the copper screw on the blue multi-turn potentiometer counter-clockwise until the output reads exactly </w:t>
+      </w:r>
+      <w:r>
+        <w:rPr>
+          <w:b/>
+        </w:rPr>
+        <w:t>12.0V DC</w:t>
+      </w:r>
+      <w:r>
+        <w:t>.</w:t>
+      </w:r>
+    </w:p>
+    <w:p>
+      <w:pPr>
+        <w:pStyle w:val="ListNumber"/>
+        <w:spacing w:after="60"/>
+      </w:pPr>
+      <w:r/>
+      <w:r>
+        <w:rPr>
+          <w:b/>
+        </w:rPr>
+        <w:t>Switched-Power GPIO Wiring</w:t>
+      </w:r>
+      <w:r>
+        <w:t>: The `EN` (Enable) pin on the MT3608 module is typically tied to `VIN+` by a tiny internal resistor. To control it programmatically, scratch or desolder the tiny bridge resistor on the boost module, then connect the `EN` pad directly to the WisBlock `IO1` pin. Pulling `IO1` HIGH wakes up the 12V boost converter to power the sensors; pulling `IO1` LOW puts the boost converter into deep sleep (&lt;1uA current draw), preserving battery life.</w:t>
+      </w:r>
+    </w:p>
+    <w:p>
+      <w:pPr>
+        <w:pStyle w:val="ListNumber"/>
+        <w:spacing w:after="60"/>
+      </w:pPr>
+      <w:r/>
+      <w:r>
+        <w:rPr>
+          <w:b/>
+        </w:rPr>
+        <w:t>Sensor Wire Terminal Splices</w:t>
+      </w:r>
+      <w:r>
+        <w:t xml:space="preserve">: To make field repairs fast and tool-free, route the sensor wires through PG9 glands into </w:t>
+      </w:r>
+      <w:r>
+        <w:rPr>
+          <w:b/>
+        </w:rPr>
+        <w:t>WAGO 221 lever-lock splicing connectors</w:t>
+      </w:r>
+      <w:r>
+        <w:t xml:space="preserve"> mounted inside the enclosure box. This avoids direct soldering of delicate sensor cables and allows quick field swaps.</w:t>
+      </w:r>
+    </w:p>
+    <w:p>
+      <w:pPr>
+        <w:spacing w:after="240"/>
+      </w:pPr>
+      <w:r>
+        <w:rPr>
+          <w:color w:val="D9D9D9"/>
+        </w:rPr>
+        <w:t>____________________________________________________</w:t>
+      </w:r>
+    </w:p>
+    <w:p>
+      <w:pPr>
+        <w:spacing w:before="360" w:after="120"/>
+      </w:pPr>
+      <w:r>
+        <w:rPr>
+          <w:b/>
+          <w:color w:val="2E75B6"/>
+          <w:sz w:val="32"/>
+        </w:rPr>
+        <w:t>V. Streamside Enclosure Box &amp; Physical Gland Assembly Layout</w:t>
+      </w:r>
+    </w:p>
+    <w:p>
+      <w:r>
+        <w:t xml:space="preserve">Whether using custom SMT PCBAs or the rapid-turnover off-the-shelf WisBlock system, streamside environmental sensors are exposed to extreme humidity, flood splattering, and rodent chewing. Hunter Morris's operations interns assemble each node into a ruggedized, waterproof </w:t>
       </w:r>
       <w:r>
         <w:rPr>
@@ -2650,9 +2935,9 @@
         <w:br/>
         <w:t xml:space="preserve">           |    |   +------------------+     +------------------+    |    |</w:t>
         <w:br/>
-        <w:t xml:space="preserve">           |    |   | 3.7V 3200mAh     |     | WisBlock PCBA    |    |    |</w:t>
+        <w:t xml:space="preserve">           |    |   | 3.7V 3200mAh     |     | WisBlock RAK     |    |    |</w:t>
         <w:br/>
-        <w:t xml:space="preserve">           |    |   | LiFePO4 Battery  |     | telemetry Core   |    |    |</w:t>
+        <w:t xml:space="preserve">           |    |   | LiFePO4 Battery  |     | Base + Modules   |    |    |</w:t>
         <w:br/>
         <w:t xml:space="preserve">           |    |   |                  |     |                  |    |    |</w:t>
         <w:br/>
@@ -2664,13 +2949,13 @@
         <w:br/>
         <w:t xml:space="preserve">           +-----------------|------------------------|-------------------+</w:t>
         <w:br/>
-        <w:t xml:space="preserve">                             |                        |</w:t>
+        <w:t xml:space="preserve">                              |                        |</w:t>
         <w:br/>
-        <w:t xml:space="preserve">                             v                        v</w:t>
+        <w:t xml:space="preserve">                              v                        v</w:t>
         <w:br/>
-        <w:t xml:space="preserve">                        [PG9 Gland 1]            [PG9 Gland 2]</w:t>
+        <w:t xml:space="preserve">                         [PG9 Gland 1]            [PG9 Gland 2]</w:t>
         <w:br/>
-        <w:t xml:space="preserve">                        (Solar +12V Feed)        (RS485 Modbus Cable to Creek)</w:t>
+        <w:t xml:space="preserve">                         (Solar +12V Feed)        (RS485 Modbus Cable to Creek)</w:t>
       </w:r>
     </w:p>
     <w:p>
@@ -2708,17 +2993,16 @@
         <w:t>ABS NEMA-67 waterproof box</w:t>
       </w:r>
       <w:r>
-        <w:t xml:space="preserve"> (internal dimensions approximately </w:t>
+        <w:t xml:space="preserve"> (internal dimensions approximately 150mm x 100mm x 70mm) fitted with a silicone rubber gasket and stainless steel lid screws (such as the vetted </w:t>
       </w:r>
       <w:r>
         <w:rPr>
-          <w:rFonts w:ascii="Georgia" w:hAnsi="Georgia"/>
-          <w:i/>
+          <w:b/>
         </w:rPr>
-        <w:t>150\text{mm} \times 100\text{mm} \times 70\text{mm}</w:t>
+        <w:t>SZOMK AK-W-11</w:t>
       </w:r>
       <w:r>
-        <w:t>) fitted with a silicone rubber gasket and stainless steel lid screws.</w:t>
+        <w:t xml:space="preserve"> model with transparent lid for visual debugging).</w:t>
       </w:r>
     </w:p>
     <w:p>
@@ -2743,17 +3027,7 @@
         <w:t>PG9 waterproof compression glands</w:t>
       </w:r>
       <w:r>
-        <w:t xml:space="preserve"> (supporting cable diameters </w:t>
-      </w:r>
-      <w:r>
-        <w:rPr>
-          <w:rFonts w:ascii="Georgia" w:hAnsi="Georgia"/>
-          <w:i/>
-        </w:rPr>
-        <w:t>4\text{mm} - 8\text{mm}</w:t>
-      </w:r>
-      <w:r>
-        <w:t>).</w:t>
+        <w:t xml:space="preserve"> (supporting cable diameters 4mm - 8mm).</w:t>
       </w:r>
     </w:p>
     <w:p>
@@ -2825,10 +3099,19 @@
         <w:rPr>
           <w:b/>
         </w:rPr>
-        <w:t>Secure Battery Bracket</w:t>
+        <w:t>Modular Mounting Plate</w:t>
       </w:r>
       <w:r>
-        <w:t>: Secure the 3.7V LiFePO4 battery inside the enclosure using a custom-printed PETG bracket and marine-grade double-sided adhesive, preventing movement during field deployments.</w:t>
+        <w:t xml:space="preserve">: Mount all components securely inside the box on a </w:t>
+      </w:r>
+      <w:r>
+        <w:rPr>
+          <w:b/>
+        </w:rPr>
+        <w:t>pre-drilled generic plastic mounting grid</w:t>
+      </w:r>
+      <w:r>
+        <w:t xml:space="preserve"> or a 3D-printed PETG bracket. The RAK19007 baseboard is screwed down onto 3mm brass standoffs, and the battery is secured with heavy-duty marine velcro.</w:t>
       </w:r>
     </w:p>
     <w:p>
@@ -2852,7 +3135,7 @@
           <w:color w:val="2E75B6"/>
           <w:sz w:val="32"/>
         </w:rPr>
-        <w:t>V. Firmware Provisioning &amp; 256-Bit Encryption Key Setup</w:t>
+        <w:t>VI. Firmware Provisioning &amp; 256-Bit Encryption Key Setup</w:t>
       </w:r>
     </w:p>
     <w:p>

</xml_diff>